<commit_message>
fix docx radar keperawatan
</commit_message>
<xml_diff>
--- a/public/doc/emr/print_radar_perawat.docx
+++ b/public/doc/emr/print_radar_perawat.docx
@@ -9,9 +9,7 @@
         <w:tblLook w:val="04A0" w:firstRow="1" w:lastRow="0" w:firstColumn="1" w:lastColumn="0" w:noHBand="0" w:noVBand="1"/>
       </w:tblPr>
       <w:tblGrid>
-        <w:gridCol w:w="534"/>
-        <w:gridCol w:w="2268"/>
-        <w:gridCol w:w="2976"/>
+        <w:gridCol w:w="5778"/>
         <w:gridCol w:w="1560"/>
         <w:gridCol w:w="850"/>
         <w:gridCol w:w="240"/>
@@ -24,7 +22,7 @@
         <w:tc>
           <w:tcPr>
             <w:tcW w:w="7338" w:type="dxa"/>
-            <w:gridSpan w:val="4"/>
+            <w:gridSpan w:val="2"/>
             <w:vAlign w:val="center"/>
           </w:tcPr>
           <w:p>
@@ -504,7 +502,7 @@
         <w:tc>
           <w:tcPr>
             <w:tcW w:w="11307" w:type="dxa"/>
-            <w:gridSpan w:val="7"/>
+            <w:gridSpan w:val="5"/>
           </w:tcPr>
           <w:p>
             <w:pPr>
@@ -566,7 +564,7 @@
         <w:tc>
           <w:tcPr>
             <w:tcW w:w="11307" w:type="dxa"/>
-            <w:gridSpan w:val="7"/>
+            <w:gridSpan w:val="5"/>
             <w:shd w:val="clear" w:color="auto" w:fill="007434"/>
           </w:tcPr>
           <w:p>
@@ -601,7 +599,7 @@
         <w:tc>
           <w:tcPr>
             <w:tcW w:w="11307" w:type="dxa"/>
-            <w:gridSpan w:val="7"/>
+            <w:gridSpan w:val="5"/>
           </w:tcPr>
           <w:p>
             <w:pPr>
@@ -638,7 +636,6 @@
         <w:tc>
           <w:tcPr>
             <w:tcW w:w="5778" w:type="dxa"/>
-            <w:gridSpan w:val="3"/>
           </w:tcPr>
           <w:p>
             <w:pPr>
@@ -648,9 +645,20 @@
               </w:rPr>
             </w:pPr>
             <w:proofErr w:type="spellStart"/>
+            <w:r>
+              <w:t>Tgl</w:t>
+            </w:r>
+            <w:proofErr w:type="spellEnd"/>
+            <w:r>
+              <w:t>.</w:t>
+            </w:r>
+            <w:r>
+              <w:t xml:space="preserve"> </w:t>
+            </w:r>
+            <w:proofErr w:type="spellStart"/>
             <w:proofErr w:type="gramStart"/>
             <w:r>
-              <w:t>Tanggal</w:t>
+              <w:t>Kunjungan</w:t>
             </w:r>
             <w:proofErr w:type="spellEnd"/>
             <w:r>
@@ -674,14 +682,46 @@
                 <w:sz w:val="17"/>
                 <w:lang w:val="en-ID"/>
               </w:rPr>
-              <w:t>FINALISASI</w:t>
+              <w:t>TGLKUNJUNGAN</w:t>
             </w:r>
             <w:r>
               <w:rPr>
                 <w:sz w:val="17"/>
+              </w:rPr>
+              <w:t>}</w:t>
+            </w:r>
+            <w:r>
+              <w:rPr>
+                <w:sz w:val="17"/>
+              </w:rPr>
+              <w:t xml:space="preserve"> </w:t>
+            </w:r>
+            <w:proofErr w:type="spellStart"/>
+            <w:r>
+              <w:rPr>
+                <w:sz w:val="17"/>
+              </w:rPr>
+              <w:t>Pukul</w:t>
+            </w:r>
+            <w:proofErr w:type="spellEnd"/>
+            <w:r>
+              <w:rPr>
+                <w:sz w:val="17"/>
+              </w:rPr>
+              <w:t xml:space="preserve"> </w:t>
+            </w:r>
+            <w:r>
+              <w:rPr>
+                <w:sz w:val="17"/>
+              </w:rPr>
+              <w:t>${</w:t>
+            </w:r>
+            <w:r>
+              <w:rPr>
+                <w:sz w:val="17"/>
                 <w:lang w:val="en-ID"/>
               </w:rPr>
-              <w:t>_TANGGAL</w:t>
+              <w:t>JAMKUNJUNGAN</w:t>
             </w:r>
             <w:r>
               <w:rPr>
@@ -703,25 +743,72 @@
                 <w:lang w:val="en-ID"/>
               </w:rPr>
             </w:pPr>
+            <w:proofErr w:type="spellStart"/>
+            <w:r>
+              <w:rPr>
+                <w:sz w:val="17"/>
+                <w:lang w:val="en-ID"/>
+              </w:rPr>
+              <w:t>Tgl</w:t>
+            </w:r>
+            <w:proofErr w:type="spellEnd"/>
+            <w:r>
+              <w:rPr>
+                <w:sz w:val="17"/>
+                <w:lang w:val="en-ID"/>
+              </w:rPr>
+              <w:t xml:space="preserve">. </w:t>
+            </w:r>
+            <w:proofErr w:type="spellStart"/>
             <w:proofErr w:type="gramStart"/>
             <w:r>
-              <w:t>Jam</w:t>
+              <w:rPr>
+                <w:sz w:val="17"/>
+                <w:lang w:val="en-ID"/>
+              </w:rPr>
+              <w:t>Pengisian</w:t>
             </w:r>
+            <w:proofErr w:type="spellEnd"/>
             <w:r>
+              <w:rPr>
+                <w:sz w:val="17"/>
+                <w:lang w:val="en-ID"/>
+              </w:rPr>
+              <w:t xml:space="preserve"> :</w:t>
+            </w:r>
+            <w:proofErr w:type="gramEnd"/>
+            <w:r>
+              <w:rPr>
+                <w:sz w:val="17"/>
+                <w:lang w:val="en-ID"/>
+              </w:rPr>
               <w:t xml:space="preserve"> </w:t>
             </w:r>
             <w:r>
-              <w:t>:</w:t>
-            </w:r>
-            <w:proofErr w:type="gramEnd"/>
-            <w:r>
-              <w:t xml:space="preserve"> </w:t>
+              <w:rPr>
+                <w:sz w:val="17"/>
+              </w:rPr>
+              <w:t>${</w:t>
             </w:r>
             <w:r>
               <w:rPr>
                 <w:sz w:val="17"/>
-              </w:rPr>
-              <w:t>${</w:t>
+                <w:lang w:val="en-ID"/>
+              </w:rPr>
+              <w:t>FINALISASI</w:t>
+            </w:r>
+            <w:r>
+              <w:rPr>
+                <w:sz w:val="17"/>
+                <w:lang w:val="en-ID"/>
+              </w:rPr>
+              <w:t>_TANGGAL</w:t>
+            </w:r>
+            <w:r>
+              <w:rPr>
+                <w:sz w:val="17"/>
+              </w:rPr>
+              <w:t>} ${</w:t>
             </w:r>
             <w:r>
               <w:rPr>
@@ -750,7 +837,7 @@
         <w:tc>
           <w:tcPr>
             <w:tcW w:w="11307" w:type="dxa"/>
-            <w:gridSpan w:val="7"/>
+            <w:gridSpan w:val="5"/>
           </w:tcPr>
           <w:p>
             <w:r>
@@ -769,7 +856,7 @@
         <w:tc>
           <w:tcPr>
             <w:tcW w:w="11307" w:type="dxa"/>
-            <w:gridSpan w:val="7"/>
+            <w:gridSpan w:val="5"/>
           </w:tcPr>
           <w:p>
             <w:pPr>
@@ -790,7 +877,7 @@
         <w:tc>
           <w:tcPr>
             <w:tcW w:w="11307" w:type="dxa"/>
-            <w:gridSpan w:val="7"/>
+            <w:gridSpan w:val="5"/>
           </w:tcPr>
           <w:p>
             <w:r>
@@ -809,7 +896,7 @@
         <w:tc>
           <w:tcPr>
             <w:tcW w:w="11307" w:type="dxa"/>
-            <w:gridSpan w:val="7"/>
+            <w:gridSpan w:val="5"/>
           </w:tcPr>
           <w:p>
             <w:pPr>
@@ -830,7 +917,7 @@
         <w:tc>
           <w:tcPr>
             <w:tcW w:w="11307" w:type="dxa"/>
-            <w:gridSpan w:val="7"/>
+            <w:gridSpan w:val="5"/>
           </w:tcPr>
           <w:p>
             <w:pPr>
@@ -857,7 +944,7 @@
         <w:tc>
           <w:tcPr>
             <w:tcW w:w="11307" w:type="dxa"/>
-            <w:gridSpan w:val="7"/>
+            <w:gridSpan w:val="5"/>
           </w:tcPr>
           <w:p>
             <w:pPr>
@@ -878,301 +965,7 @@
         <w:tc>
           <w:tcPr>
             <w:tcW w:w="11307" w:type="dxa"/>
-            <w:gridSpan w:val="7"/>
-          </w:tcPr>
-          <w:p>
-            <w:pPr>
-              <w:rPr>
-                <w:b/>
-                <w:bCs/>
-                <w:sz w:val="20"/>
-                <w:szCs w:val="20"/>
-              </w:rPr>
-            </w:pPr>
-            <w:r>
-              <w:rPr>
-                <w:b/>
-                <w:bCs/>
-                <w:sz w:val="20"/>
-                <w:szCs w:val="20"/>
-              </w:rPr>
-              <w:t>KRITERIA TRIAGE</w:t>
-            </w:r>
-          </w:p>
-        </w:tc>
-      </w:tr>
-      <w:tr>
-        <w:tc>
-          <w:tcPr>
-            <w:tcW w:w="11307" w:type="dxa"/>
-            <w:gridSpan w:val="7"/>
-          </w:tcPr>
-          <w:p>
-            <w:pPr>
-              <w:rPr>
-                <w:szCs w:val="18"/>
-              </w:rPr>
-            </w:pPr>
-            <w:r>
-              <w:rPr>
-                <w:szCs w:val="18"/>
-              </w:rPr>
-              <w:t>${TRIAGE_KRITERIA}</w:t>
-            </w:r>
-          </w:p>
-        </w:tc>
-      </w:tr>
-      <w:tr>
-        <w:tc>
-          <w:tcPr>
-            <w:tcW w:w="11307" w:type="dxa"/>
-            <w:gridSpan w:val="7"/>
-          </w:tcPr>
-          <w:p>
-            <w:pPr>
-              <w:rPr>
-                <w:b/>
-                <w:bCs/>
-                <w:sz w:val="20"/>
-                <w:szCs w:val="20"/>
-              </w:rPr>
-            </w:pPr>
-            <w:r>
-              <w:rPr>
-                <w:b/>
-                <w:bCs/>
-                <w:sz w:val="20"/>
-                <w:szCs w:val="20"/>
-              </w:rPr>
-              <w:t>AUSTRALIAN TRIAGE SCALE (ATS)</w:t>
-            </w:r>
-          </w:p>
-        </w:tc>
-      </w:tr>
-      <w:tr>
-        <w:tc>
-          <w:tcPr>
-            <w:tcW w:w="11307" w:type="dxa"/>
-            <w:gridSpan w:val="7"/>
-          </w:tcPr>
-          <w:p>
-            <w:pPr>
-              <w:rPr>
-                <w:szCs w:val="18"/>
-              </w:rPr>
-            </w:pPr>
-            <w:r>
-              <w:rPr>
-                <w:szCs w:val="18"/>
-              </w:rPr>
-              <w:t>${ATS_KATEGORI}</w:t>
-            </w:r>
-          </w:p>
-        </w:tc>
-      </w:tr>
-      <w:tr>
-        <w:tc>
-          <w:tcPr>
-            <w:tcW w:w="534" w:type="dxa"/>
-            <w:tcBorders>
-              <w:top w:val="single" w:sz="4" w:space="0" w:color="auto"/>
-              <w:left w:val="single" w:sz="4" w:space="0" w:color="auto"/>
-              <w:bottom w:val="single" w:sz="4" w:space="0" w:color="auto"/>
-              <w:right w:val="nil"/>
-            </w:tcBorders>
-          </w:tcPr>
-          <w:p>
-            <w:pPr>
-              <w:rPr>
-                <w:szCs w:val="18"/>
-              </w:rPr>
-            </w:pPr>
-          </w:p>
-        </w:tc>
-        <w:tc>
-          <w:tcPr>
-            <w:tcW w:w="2268" w:type="dxa"/>
-            <w:tcBorders>
-              <w:top w:val="single" w:sz="4" w:space="0" w:color="auto"/>
-              <w:left w:val="nil"/>
-              <w:bottom w:val="single" w:sz="4" w:space="0" w:color="auto"/>
-              <w:right w:val="single" w:sz="4" w:space="0" w:color="auto"/>
-            </w:tcBorders>
-          </w:tcPr>
-          <w:p>
-            <w:pPr>
-              <w:rPr>
-                <w:szCs w:val="18"/>
-              </w:rPr>
-            </w:pPr>
-            <w:r>
-              <w:rPr>
-                <w:szCs w:val="18"/>
-              </w:rPr>
-              <w:t>PRIORITAS</w:t>
-            </w:r>
-          </w:p>
-        </w:tc>
-        <w:tc>
-          <w:tcPr>
-            <w:tcW w:w="8505" w:type="dxa"/>
             <w:gridSpan w:val="5"/>
-            <w:tcBorders>
-              <w:left w:val="single" w:sz="4" w:space="0" w:color="auto"/>
-            </w:tcBorders>
-          </w:tcPr>
-          <w:p>
-            <w:pPr>
-              <w:rPr>
-                <w:szCs w:val="18"/>
-              </w:rPr>
-            </w:pPr>
-            <w:r>
-              <w:rPr>
-                <w:szCs w:val="18"/>
-              </w:rPr>
-              <w:t>${ATS_PRIORITAS}</w:t>
-            </w:r>
-          </w:p>
-        </w:tc>
-      </w:tr>
-      <w:tr>
-        <w:tc>
-          <w:tcPr>
-            <w:tcW w:w="534" w:type="dxa"/>
-            <w:tcBorders>
-              <w:top w:val="single" w:sz="4" w:space="0" w:color="auto"/>
-              <w:left w:val="single" w:sz="4" w:space="0" w:color="auto"/>
-              <w:bottom w:val="single" w:sz="4" w:space="0" w:color="auto"/>
-              <w:right w:val="nil"/>
-            </w:tcBorders>
-          </w:tcPr>
-          <w:p>
-            <w:pPr>
-              <w:rPr>
-                <w:szCs w:val="18"/>
-              </w:rPr>
-            </w:pPr>
-          </w:p>
-        </w:tc>
-        <w:tc>
-          <w:tcPr>
-            <w:tcW w:w="2268" w:type="dxa"/>
-            <w:tcBorders>
-              <w:top w:val="single" w:sz="4" w:space="0" w:color="auto"/>
-              <w:left w:val="nil"/>
-              <w:bottom w:val="single" w:sz="4" w:space="0" w:color="auto"/>
-              <w:right w:val="single" w:sz="4" w:space="0" w:color="auto"/>
-            </w:tcBorders>
-          </w:tcPr>
-          <w:p>
-            <w:pPr>
-              <w:rPr>
-                <w:szCs w:val="18"/>
-              </w:rPr>
-            </w:pPr>
-            <w:r>
-              <w:rPr>
-                <w:szCs w:val="18"/>
-              </w:rPr>
-              <w:t>PLAN / RENCANA</w:t>
-            </w:r>
-          </w:p>
-        </w:tc>
-        <w:tc>
-          <w:tcPr>
-            <w:tcW w:w="8505" w:type="dxa"/>
-            <w:gridSpan w:val="5"/>
-            <w:tcBorders>
-              <w:left w:val="single" w:sz="4" w:space="0" w:color="auto"/>
-            </w:tcBorders>
-          </w:tcPr>
-          <w:p>
-            <w:pPr>
-              <w:rPr>
-                <w:szCs w:val="18"/>
-              </w:rPr>
-            </w:pPr>
-            <w:r>
-              <w:rPr>
-                <w:szCs w:val="18"/>
-              </w:rPr>
-              <w:t>${ATS_PLAN}</w:t>
-            </w:r>
-          </w:p>
-        </w:tc>
-      </w:tr>
-      <w:tr>
-        <w:tc>
-          <w:tcPr>
-            <w:tcW w:w="534" w:type="dxa"/>
-            <w:tcBorders>
-              <w:top w:val="single" w:sz="4" w:space="0" w:color="auto"/>
-              <w:left w:val="single" w:sz="4" w:space="0" w:color="auto"/>
-              <w:bottom w:val="single" w:sz="4" w:space="0" w:color="auto"/>
-              <w:right w:val="nil"/>
-            </w:tcBorders>
-          </w:tcPr>
-          <w:p>
-            <w:pPr>
-              <w:rPr>
-                <w:szCs w:val="18"/>
-              </w:rPr>
-            </w:pPr>
-          </w:p>
-        </w:tc>
-        <w:tc>
-          <w:tcPr>
-            <w:tcW w:w="2268" w:type="dxa"/>
-            <w:tcBorders>
-              <w:top w:val="single" w:sz="4" w:space="0" w:color="auto"/>
-              <w:left w:val="nil"/>
-              <w:bottom w:val="single" w:sz="4" w:space="0" w:color="auto"/>
-              <w:right w:val="single" w:sz="4" w:space="0" w:color="auto"/>
-            </w:tcBorders>
-          </w:tcPr>
-          <w:p>
-            <w:pPr>
-              <w:rPr>
-                <w:szCs w:val="18"/>
-              </w:rPr>
-            </w:pPr>
-            <w:r>
-              <w:rPr>
-                <w:szCs w:val="18"/>
-              </w:rPr>
-              <w:t>RINCIAN TRIAGE</w:t>
-            </w:r>
-          </w:p>
-        </w:tc>
-        <w:tc>
-          <w:tcPr>
-            <w:tcW w:w="8505" w:type="dxa"/>
-            <w:gridSpan w:val="5"/>
-            <w:tcBorders>
-              <w:left w:val="single" w:sz="4" w:space="0" w:color="auto"/>
-            </w:tcBorders>
-          </w:tcPr>
-          <w:p>
-            <w:pPr>
-              <w:rPr>
-                <w:szCs w:val="18"/>
-              </w:rPr>
-            </w:pPr>
-            <w:r>
-              <w:rPr>
-                <w:szCs w:val="18"/>
-              </w:rPr>
-              <w:t>${ATS_DETAIL}</w:t>
-            </w:r>
-          </w:p>
-        </w:tc>
-      </w:tr>
-      <w:tr>
-        <w:tc>
-          <w:tcPr>
-            <w:tcW w:w="11307" w:type="dxa"/>
-            <w:gridSpan w:val="7"/>
           </w:tcPr>
           <w:p>
             <w:pPr>
@@ -1199,7 +992,7 @@
         <w:tc>
           <w:tcPr>
             <w:tcW w:w="11307" w:type="dxa"/>
-            <w:gridSpan w:val="7"/>
+            <w:gridSpan w:val="5"/>
           </w:tcPr>
           <w:p>
             <w:pPr>
@@ -1220,7 +1013,7 @@
         <w:tc>
           <w:tcPr>
             <w:tcW w:w="11307" w:type="dxa"/>
-            <w:gridSpan w:val="7"/>
+            <w:gridSpan w:val="5"/>
           </w:tcPr>
           <w:p>
             <w:pPr>
@@ -1238,7 +1031,7 @@
                 <w:sz w:val="20"/>
                 <w:szCs w:val="20"/>
               </w:rPr>
-              <w:t>PRIMARY SURVEY</w:t>
+              <w:t>TANDA VITAL</w:t>
             </w:r>
           </w:p>
         </w:tc>
@@ -1247,7 +1040,7 @@
         <w:tc>
           <w:tcPr>
             <w:tcW w:w="11307" w:type="dxa"/>
-            <w:gridSpan w:val="7"/>
+            <w:gridSpan w:val="5"/>
           </w:tcPr>
           <w:p>
             <w:pPr>
@@ -1259,7 +1052,19 @@
               <w:rPr>
                 <w:szCs w:val="18"/>
               </w:rPr>
-              <w:t>${PRIMARY_SURVEY}</w:t>
+              <w:t>${</w:t>
+            </w:r>
+            <w:r>
+              <w:rPr>
+                <w:szCs w:val="18"/>
+              </w:rPr>
+              <w:t>TANDA_VITAL</w:t>
+            </w:r>
+            <w:r>
+              <w:rPr>
+                <w:szCs w:val="18"/>
+              </w:rPr>
+              <w:t>}</w:t>
             </w:r>
           </w:p>
         </w:tc>
@@ -1268,7 +1073,7 @@
         <w:tc>
           <w:tcPr>
             <w:tcW w:w="11307" w:type="dxa"/>
-            <w:gridSpan w:val="7"/>
+            <w:gridSpan w:val="5"/>
           </w:tcPr>
           <w:p>
             <w:pPr>
@@ -1295,7 +1100,7 @@
         <w:tc>
           <w:tcPr>
             <w:tcW w:w="11307" w:type="dxa"/>
-            <w:gridSpan w:val="7"/>
+            <w:gridSpan w:val="5"/>
           </w:tcPr>
           <w:p>
             <w:pPr>
@@ -1316,55 +1121,7 @@
         <w:tc>
           <w:tcPr>
             <w:tcW w:w="11307" w:type="dxa"/>
-            <w:gridSpan w:val="7"/>
-          </w:tcPr>
-          <w:p>
-            <w:pPr>
-              <w:rPr>
-                <w:b/>
-                <w:bCs/>
-                <w:sz w:val="20"/>
-                <w:szCs w:val="20"/>
-              </w:rPr>
-            </w:pPr>
-            <w:r>
-              <w:rPr>
-                <w:b/>
-                <w:bCs/>
-                <w:sz w:val="20"/>
-                <w:szCs w:val="20"/>
-              </w:rPr>
-              <w:t>ANAMNESIS DIPEROLEH</w:t>
-            </w:r>
-          </w:p>
-        </w:tc>
-      </w:tr>
-      <w:tr>
-        <w:tc>
-          <w:tcPr>
-            <w:tcW w:w="11307" w:type="dxa"/>
-            <w:gridSpan w:val="7"/>
-          </w:tcPr>
-          <w:p>
-            <w:pPr>
-              <w:rPr>
-                <w:szCs w:val="18"/>
-              </w:rPr>
-            </w:pPr>
-            <w:r>
-              <w:rPr>
-                <w:szCs w:val="18"/>
-              </w:rPr>
-              <w:t>${ANAMNESIS_DIPEROLEH}</w:t>
-            </w:r>
-          </w:p>
-        </w:tc>
-      </w:tr>
-      <w:tr>
-        <w:tc>
-          <w:tcPr>
-            <w:tcW w:w="11307" w:type="dxa"/>
-            <w:gridSpan w:val="7"/>
+            <w:gridSpan w:val="5"/>
           </w:tcPr>
           <w:p>
             <w:pPr>
@@ -1391,7 +1148,7 @@
         <w:tc>
           <w:tcPr>
             <w:tcW w:w="11307" w:type="dxa"/>
-            <w:gridSpan w:val="7"/>
+            <w:gridSpan w:val="5"/>
           </w:tcPr>
           <w:p>
             <w:pPr>
@@ -1412,7 +1169,7 @@
         <w:tc>
           <w:tcPr>
             <w:tcW w:w="11307" w:type="dxa"/>
-            <w:gridSpan w:val="7"/>
+            <w:gridSpan w:val="5"/>
           </w:tcPr>
           <w:p>
             <w:pPr>
@@ -1439,7 +1196,7 @@
         <w:tc>
           <w:tcPr>
             <w:tcW w:w="11307" w:type="dxa"/>
-            <w:gridSpan w:val="7"/>
+            <w:gridSpan w:val="5"/>
           </w:tcPr>
           <w:p>
             <w:pPr>
@@ -1460,7 +1217,7 @@
         <w:tc>
           <w:tcPr>
             <w:tcW w:w="11307" w:type="dxa"/>
-            <w:gridSpan w:val="7"/>
+            <w:gridSpan w:val="5"/>
           </w:tcPr>
           <w:p>
             <w:pPr>
@@ -1487,7 +1244,7 @@
         <w:tc>
           <w:tcPr>
             <w:tcW w:w="11307" w:type="dxa"/>
-            <w:gridSpan w:val="7"/>
+            <w:gridSpan w:val="5"/>
           </w:tcPr>
           <w:p>
             <w:pPr>
@@ -1508,7 +1265,7 @@
         <w:tc>
           <w:tcPr>
             <w:tcW w:w="11307" w:type="dxa"/>
-            <w:gridSpan w:val="7"/>
+            <w:gridSpan w:val="5"/>
           </w:tcPr>
           <w:p>
             <w:pPr>
@@ -1526,7 +1283,7 @@
                 <w:sz w:val="20"/>
                 <w:szCs w:val="20"/>
               </w:rPr>
-              <w:t>SKRINING RISIKO JATUH — HUMPTY DUMPTY</w:t>
+              <w:t>SKRINING RISIKO JATUH</w:t>
             </w:r>
           </w:p>
         </w:tc>
@@ -1535,7 +1292,7 @@
         <w:tc>
           <w:tcPr>
             <w:tcW w:w="11307" w:type="dxa"/>
-            <w:gridSpan w:val="7"/>
+            <w:gridSpan w:val="5"/>
           </w:tcPr>
           <w:p>
             <w:pPr>
@@ -1547,7 +1304,7 @@
               <w:rPr>
                 <w:szCs w:val="18"/>
               </w:rPr>
-              <w:t>${RISIKO_JATUH_HUMPTY_DUMPTY}</w:t>
+              <w:t>${RISIKO_JATUH}</w:t>
             </w:r>
           </w:p>
         </w:tc>
@@ -1556,7 +1313,7 @@
         <w:tc>
           <w:tcPr>
             <w:tcW w:w="11307" w:type="dxa"/>
-            <w:gridSpan w:val="7"/>
+            <w:gridSpan w:val="5"/>
           </w:tcPr>
           <w:p>
             <w:pPr>
@@ -1574,7 +1331,7 @@
                 <w:sz w:val="20"/>
                 <w:szCs w:val="20"/>
               </w:rPr>
-              <w:t>SKRINING RISIKO JATUH — SKALA MORSE</w:t>
+              <w:t>SKRINING GIZI</w:t>
             </w:r>
           </w:p>
         </w:tc>
@@ -1583,7 +1340,7 @@
         <w:tc>
           <w:tcPr>
             <w:tcW w:w="11307" w:type="dxa"/>
-            <w:gridSpan w:val="7"/>
+            <w:gridSpan w:val="5"/>
           </w:tcPr>
           <w:p>
             <w:pPr>
@@ -1595,7 +1352,7 @@
               <w:rPr>
                 <w:szCs w:val="18"/>
               </w:rPr>
-              <w:t>${RISIKO_JATUH_MORSE}</w:t>
+              <w:t>${SKRINING_GIZI}</w:t>
             </w:r>
           </w:p>
         </w:tc>
@@ -1604,199 +1361,7 @@
         <w:tc>
           <w:tcPr>
             <w:tcW w:w="11307" w:type="dxa"/>
-            <w:gridSpan w:val="7"/>
-          </w:tcPr>
-          <w:p>
-            <w:pPr>
-              <w:rPr>
-                <w:b/>
-                <w:bCs/>
-                <w:sz w:val="20"/>
-                <w:szCs w:val="20"/>
-              </w:rPr>
-            </w:pPr>
-            <w:r>
-              <w:rPr>
-                <w:b/>
-                <w:bCs/>
-                <w:sz w:val="20"/>
-                <w:szCs w:val="20"/>
-              </w:rPr>
-              <w:t>SKRINING RISIKO JATUH — EPFRA</w:t>
-            </w:r>
-          </w:p>
-        </w:tc>
-      </w:tr>
-      <w:tr>
-        <w:tc>
-          <w:tcPr>
-            <w:tcW w:w="11307" w:type="dxa"/>
-            <w:gridSpan w:val="7"/>
-          </w:tcPr>
-          <w:p>
-            <w:pPr>
-              <w:rPr>
-                <w:szCs w:val="18"/>
-              </w:rPr>
-            </w:pPr>
-            <w:r>
-              <w:rPr>
-                <w:szCs w:val="18"/>
-              </w:rPr>
-              <w:t>${RISIKO_JATUH_EPFRA}</w:t>
-            </w:r>
-          </w:p>
-        </w:tc>
-      </w:tr>
-      <w:tr>
-        <w:tc>
-          <w:tcPr>
-            <w:tcW w:w="11307" w:type="dxa"/>
-            <w:gridSpan w:val="7"/>
-          </w:tcPr>
-          <w:p>
-            <w:pPr>
-              <w:rPr>
-                <w:b/>
-                <w:bCs/>
-                <w:sz w:val="20"/>
-                <w:szCs w:val="20"/>
-              </w:rPr>
-            </w:pPr>
-            <w:r>
-              <w:rPr>
-                <w:b/>
-                <w:bCs/>
-                <w:sz w:val="20"/>
-                <w:szCs w:val="20"/>
-              </w:rPr>
-              <w:t>SKRINING RISIKO JATUH — GET UP AND GO</w:t>
-            </w:r>
-          </w:p>
-        </w:tc>
-      </w:tr>
-      <w:tr>
-        <w:tc>
-          <w:tcPr>
-            <w:tcW w:w="11307" w:type="dxa"/>
-            <w:gridSpan w:val="7"/>
-          </w:tcPr>
-          <w:p>
-            <w:pPr>
-              <w:rPr>
-                <w:szCs w:val="18"/>
-              </w:rPr>
-            </w:pPr>
-            <w:r>
-              <w:rPr>
-                <w:szCs w:val="18"/>
-              </w:rPr>
-              <w:t>${RISIKO_JATUH_GET_UP_AND_GO}</w:t>
-            </w:r>
-          </w:p>
-        </w:tc>
-      </w:tr>
-      <w:tr>
-        <w:tc>
-          <w:tcPr>
-            <w:tcW w:w="11307" w:type="dxa"/>
-            <w:gridSpan w:val="7"/>
-          </w:tcPr>
-          <w:p>
-            <w:pPr>
-              <w:rPr>
-                <w:b/>
-                <w:bCs/>
-                <w:sz w:val="20"/>
-                <w:szCs w:val="20"/>
-              </w:rPr>
-            </w:pPr>
-            <w:r>
-              <w:rPr>
-                <w:b/>
-                <w:bCs/>
-                <w:sz w:val="20"/>
-                <w:szCs w:val="20"/>
-              </w:rPr>
-              <w:t>SKRINING GIZI — MST</w:t>
-            </w:r>
-          </w:p>
-        </w:tc>
-      </w:tr>
-      <w:tr>
-        <w:tc>
-          <w:tcPr>
-            <w:tcW w:w="11307" w:type="dxa"/>
-            <w:gridSpan w:val="7"/>
-          </w:tcPr>
-          <w:p>
-            <w:pPr>
-              <w:rPr>
-                <w:szCs w:val="18"/>
-              </w:rPr>
-            </w:pPr>
-            <w:r>
-              <w:rPr>
-                <w:szCs w:val="18"/>
-              </w:rPr>
-              <w:t>${SKRINING_GIZI_MUST}</w:t>
-            </w:r>
-          </w:p>
-        </w:tc>
-      </w:tr>
-      <w:tr>
-        <w:tc>
-          <w:tcPr>
-            <w:tcW w:w="11307" w:type="dxa"/>
-            <w:gridSpan w:val="7"/>
-          </w:tcPr>
-          <w:p>
-            <w:pPr>
-              <w:rPr>
-                <w:b/>
-                <w:bCs/>
-                <w:sz w:val="20"/>
-                <w:szCs w:val="20"/>
-              </w:rPr>
-            </w:pPr>
-            <w:r>
-              <w:rPr>
-                <w:b/>
-                <w:bCs/>
-                <w:sz w:val="20"/>
-                <w:szCs w:val="20"/>
-              </w:rPr>
-              <w:t>SKRINING GIZI — STRONG KID</w:t>
-            </w:r>
-          </w:p>
-        </w:tc>
-      </w:tr>
-      <w:tr>
-        <w:tc>
-          <w:tcPr>
-            <w:tcW w:w="11307" w:type="dxa"/>
-            <w:gridSpan w:val="7"/>
-          </w:tcPr>
-          <w:p>
-            <w:pPr>
-              <w:rPr>
-                <w:szCs w:val="18"/>
-              </w:rPr>
-            </w:pPr>
-            <w:r>
-              <w:rPr>
-                <w:szCs w:val="18"/>
-              </w:rPr>
-              <w:t>${SKRINING_GIZI_STRONG_KID}</w:t>
-            </w:r>
-          </w:p>
-        </w:tc>
-      </w:tr>
-      <w:tr>
-        <w:tc>
-          <w:tcPr>
-            <w:tcW w:w="11307" w:type="dxa"/>
-            <w:gridSpan w:val="7"/>
+            <w:gridSpan w:val="5"/>
           </w:tcPr>
           <w:p>
             <w:pPr>
@@ -1823,7 +1388,7 @@
         <w:tc>
           <w:tcPr>
             <w:tcW w:w="11307" w:type="dxa"/>
-            <w:gridSpan w:val="7"/>
+            <w:gridSpan w:val="5"/>
           </w:tcPr>
           <w:p>
             <w:pPr>
@@ -1844,7 +1409,7 @@
         <w:tc>
           <w:tcPr>
             <w:tcW w:w="11307" w:type="dxa"/>
-            <w:gridSpan w:val="7"/>
+            <w:gridSpan w:val="5"/>
           </w:tcPr>
           <w:p>
             <w:pPr>
@@ -1871,7 +1436,7 @@
         <w:tc>
           <w:tcPr>
             <w:tcW w:w="11307" w:type="dxa"/>
-            <w:gridSpan w:val="7"/>
+            <w:gridSpan w:val="5"/>
           </w:tcPr>
           <w:p>
             <w:pPr>
@@ -1892,7 +1457,7 @@
         <w:tc>
           <w:tcPr>
             <w:tcW w:w="11307" w:type="dxa"/>
-            <w:gridSpan w:val="7"/>
+            <w:gridSpan w:val="5"/>
           </w:tcPr>
           <w:p>
             <w:pPr>
@@ -1919,7 +1484,7 @@
         <w:tc>
           <w:tcPr>
             <w:tcW w:w="11307" w:type="dxa"/>
-            <w:gridSpan w:val="7"/>
+            <w:gridSpan w:val="5"/>
           </w:tcPr>
           <w:p>
             <w:pPr>
@@ -1940,7 +1505,7 @@
         <w:tc>
           <w:tcPr>
             <w:tcW w:w="11307" w:type="dxa"/>
-            <w:gridSpan w:val="7"/>
+            <w:gridSpan w:val="5"/>
             <w:tcBorders>
               <w:bottom w:val="single" w:sz="4" w:space="0" w:color="auto"/>
             </w:tcBorders>
@@ -1971,7 +1536,7 @@
         <w:tc>
           <w:tcPr>
             <w:tcW w:w="11307" w:type="dxa"/>
-            <w:gridSpan w:val="7"/>
+            <w:gridSpan w:val="5"/>
             <w:tcBorders>
               <w:bottom w:val="single" w:sz="4" w:space="0" w:color="auto"/>
             </w:tcBorders>
@@ -1996,7 +1561,7 @@
         <w:tc>
           <w:tcPr>
             <w:tcW w:w="11307" w:type="dxa"/>
-            <w:gridSpan w:val="7"/>
+            <w:gridSpan w:val="5"/>
             <w:tcBorders>
               <w:top w:val="single" w:sz="4" w:space="0" w:color="auto"/>
               <w:left w:val="nil"/>
@@ -2018,7 +1583,6 @@
         <w:tc>
           <w:tcPr>
             <w:tcW w:w="5778" w:type="dxa"/>
-            <w:gridSpan w:val="3"/>
             <w:tcBorders>
               <w:top w:val="nil"/>
               <w:left w:val="nil"/>
@@ -2369,14 +1933,7 @@
                 <w:sz w:val="17"/>
                 <w:lang w:val="en-ID"/>
               </w:rPr>
-              <w:t>FINALISASI</w:t>
-            </w:r>
-            <w:r>
-              <w:rPr>
-                <w:sz w:val="17"/>
-                <w:lang w:val="en-ID"/>
-              </w:rPr>
-              <w:t>_TANGGAL</w:t>
+              <w:t>TTE_TANGGAL</w:t>
             </w:r>
             <w:r>
               <w:rPr>

</xml_diff>